<commit_message>
report add github url
</commit_message>
<xml_diff>
--- a/ThmanyahReport.docx
+++ b/ThmanyahReport.docx
@@ -69,6 +69,29 @@
     </w:p>
     <w:p>
       <w:pPr>
+        <w:jc w:val="center"/>
+        <w:rPr>
+          <w:rFonts w:ascii="IBM Plex Sans Arabic SemiBold" w:hAnsi="IBM Plex Sans Arabic SemiBold" w:cs="IBM Plex Sans Arabic SemiBold"/>
+          <w:b/>
+          <w:bCs/>
+          <w:color w:val="002060"/>
+          <w:rtl/>
+        </w:rPr>
+      </w:pPr>
+      <w:hyperlink r:id="rId7" w:history="1">
+        <w:r>
+          <w:rPr>
+            <w:rStyle w:val="Hyperlink"/>
+            <w:rFonts w:ascii="IBM Plex Sans Arabic SemiBold" w:hAnsi="IBM Plex Sans Arabic SemiBold" w:cs="IBM Plex Sans Arabic SemiBold"/>
+            <w:b/>
+            <w:bCs/>
+          </w:rPr>
+          <w:t>https://github.com/mibnrashid/ThmanyahProject</w:t>
+        </w:r>
+      </w:hyperlink>
+    </w:p>
+    <w:p>
+      <w:pPr>
         <w:bidi/>
         <w:rPr>
           <w:rFonts w:ascii="IBM Plex Sans Arabic SemiBold" w:hAnsi="IBM Plex Sans Arabic SemiBold" w:cs="IBM Plex Sans Arabic SemiBold"/>
@@ -84,7 +107,7 @@
           <w:rFonts w:ascii="IBM Plex Sans Arabic" w:hAnsi="IBM Plex Sans Arabic" w:cs="IBM Plex Sans Arabic"/>
         </w:rPr>
         <w:pict w14:anchorId="3FA2DE7A">
-          <v:rect id="_x0000_i1035" style="width:0;height:1.5pt" o:hralign="center" o:hrstd="t" o:hr="t" fillcolor="#a0a0a0" stroked="f"/>
+          <v:rect id="_x0000_i1026" style="width:0;height:1.5pt" o:hralign="center" o:hrstd="t" o:hr="t" fillcolor="#a0a0a0" stroked="f"/>
         </w:pict>
       </w:r>
     </w:p>
@@ -490,7 +513,7 @@
           <w:rFonts w:ascii="IBM Plex Sans Arabic" w:hAnsi="IBM Plex Sans Arabic" w:cs="IBM Plex Sans Arabic"/>
         </w:rPr>
         <w:pict w14:anchorId="1BD3808F">
-          <v:rect id="_x0000_i1025" style="width:0;height:1.5pt" o:hralign="center" o:hrstd="t" o:hr="t" fillcolor="#a0a0a0" stroked="f"/>
+          <v:rect id="_x0000_i1027" style="width:0;height:1.5pt" o:hralign="center" o:hrstd="t" o:hr="t" fillcolor="#a0a0a0" stroked="f"/>
         </w:pict>
       </w:r>
     </w:p>
@@ -692,6 +715,7 @@
           <w:rFonts w:ascii="IBM Plex Sans Arabic" w:hAnsi="IBM Plex Sans Arabic" w:cs="IBM Plex Sans Arabic"/>
           <w:rtl/>
         </w:rPr>
+        <w:lastRenderedPageBreak/>
         <w:t>فهم مفاهيم</w:t>
       </w:r>
       <w:r>
@@ -730,7 +754,6 @@
           <w:rFonts w:ascii="IBM Plex Sans Arabic" w:hAnsi="IBM Plex Sans Arabic" w:cs="IBM Plex Sans Arabic"/>
           <w:rtl/>
         </w:rPr>
-        <w:lastRenderedPageBreak/>
         <w:t>المحافظة على</w:t>
       </w:r>
       <w:r>
@@ -807,7 +830,7 @@
           <w:rFonts w:ascii="IBM Plex Sans Arabic" w:hAnsi="IBM Plex Sans Arabic" w:cs="IBM Plex Sans Arabic"/>
         </w:rPr>
         <w:pict w14:anchorId="1BF7AAF2">
-          <v:rect id="_x0000_i1026" style="width:0;height:1.5pt" o:hralign="center" o:hrstd="t" o:hr="t" fillcolor="#a0a0a0" stroked="f"/>
+          <v:rect id="_x0000_i1028" style="width:0;height:1.5pt" o:hralign="center" o:hrstd="t" o:hr="t" fillcolor="#a0a0a0" stroked="f"/>
         </w:pict>
       </w:r>
     </w:p>
@@ -1064,7 +1087,7 @@
           <w:rFonts w:ascii="IBM Plex Sans Arabic" w:hAnsi="IBM Plex Sans Arabic" w:cs="IBM Plex Sans Arabic"/>
         </w:rPr>
         <w:pict w14:anchorId="0765CADA">
-          <v:rect id="_x0000_i1027" style="width:0;height:1.5pt" o:hralign="center" o:hrstd="t" o:hr="t" fillcolor="#a0a0a0" stroked="f"/>
+          <v:rect id="_x0000_i1029" style="width:0;height:1.5pt" o:hralign="center" o:hrstd="t" o:hr="t" fillcolor="#a0a0a0" stroked="f"/>
         </w:pict>
       </w:r>
     </w:p>
@@ -1360,25 +1383,9 @@
           <w:rFonts w:ascii="IBM Plex Sans Arabic" w:hAnsi="IBM Plex Sans Arabic" w:cs="IBM Plex Sans Arabic"/>
         </w:rPr>
         <w:pict w14:anchorId="6723C4DD">
-          <v:rect id="_x0000_i1039" style="width:0;height:1.5pt" o:hralign="center" o:bullet="t" o:hrstd="t" o:hr="t" fillcolor="#a0a0a0" stroked="f"/>
+          <v:rect id="_x0000_i1030" style="width:0;height:1.5pt" o:hralign="center" o:bullet="t" o:hrstd="t" o:hr="t" fillcolor="#a0a0a0" stroked="f"/>
         </w:pict>
       </w:r>
-    </w:p>
-    <w:p>
-      <w:pPr>
-        <w:bidi/>
-        <w:rPr>
-          <w:rFonts w:ascii="IBM Plex Sans Arabic" w:hAnsi="IBM Plex Sans Arabic" w:cs="IBM Plex Sans Arabic"/>
-        </w:rPr>
-      </w:pPr>
-    </w:p>
-    <w:p>
-      <w:pPr>
-        <w:bidi/>
-        <w:rPr>
-          <w:rFonts w:ascii="IBM Plex Sans Arabic" w:hAnsi="IBM Plex Sans Arabic" w:cs="IBM Plex Sans Arabic"/>
-        </w:rPr>
-      </w:pPr>
     </w:p>
     <w:p>
       <w:pPr>
@@ -1448,6 +1455,7 @@
       <w:r>
         <w:rPr>
           <w:rFonts w:ascii="IBM Plex Sans Arabic" w:hAnsi="IBM Plex Sans Arabic" w:cs="IBM Plex Sans Arabic"/>
+          <w:noProof/>
           <w:rtl/>
           <w:lang w:val="en-GB"/>
         </w:rPr>
@@ -1467,7 +1475,7 @@
                     <pic:cNvPicPr/>
                   </pic:nvPicPr>
                   <pic:blipFill rotWithShape="1">
-                    <a:blip r:embed="rId7"/>
+                    <a:blip r:embed="rId8"/>
                     <a:srcRect t="1" b="-6700"/>
                     <a:stretch>
                       <a:fillRect/>
@@ -1509,7 +1517,7 @@
           <w:rFonts w:ascii="IBM Plex Sans Arabic" w:hAnsi="IBM Plex Sans Arabic" w:cs="IBM Plex Sans Arabic"/>
         </w:rPr>
         <w:pict w14:anchorId="624450EA">
-          <v:rect id="_x0000_i1029" style="width:0;height:1.5pt" o:hralign="center" o:hrstd="t" o:hr="t" fillcolor="#a0a0a0" stroked="f"/>
+          <v:rect id="_x0000_i1031" style="width:0;height:1.5pt" o:hralign="center" o:hrstd="t" o:hr="t" fillcolor="#a0a0a0" stroked="f"/>
         </w:pict>
       </w:r>
     </w:p>
@@ -1774,12 +1782,12 @@
       </w:pPr>
     </w:p>
     <w:sectPr>
-      <w:headerReference w:type="even" r:id="rId8"/>
-      <w:headerReference w:type="default" r:id="rId9"/>
-      <w:footerReference w:type="even" r:id="rId10"/>
-      <w:footerReference w:type="default" r:id="rId11"/>
-      <w:headerReference w:type="first" r:id="rId12"/>
-      <w:footerReference w:type="first" r:id="rId13"/>
+      <w:headerReference w:type="even" r:id="rId9"/>
+      <w:headerReference w:type="default" r:id="rId10"/>
+      <w:footerReference w:type="even" r:id="rId11"/>
+      <w:footerReference w:type="default" r:id="rId12"/>
+      <w:headerReference w:type="first" r:id="rId13"/>
+      <w:footerReference w:type="first" r:id="rId14"/>
       <w:pgSz w:w="12240" w:h="15840"/>
       <w:pgMar w:top="1440" w:right="1440" w:bottom="1440" w:left="1440" w:header="708" w:footer="708" w:gutter="0"/>
       <w:cols w:space="708"/>
@@ -3722,6 +3730,29 @@
     <w:uiPriority w:val="99"/>
     <w:rsid w:val="00B81EF0"/>
   </w:style>
+  <w:style w:type="character" w:styleId="Hyperlink">
+    <w:name w:val="Hyperlink"/>
+    <w:basedOn w:val="DefaultParagraphFont"/>
+    <w:uiPriority w:val="99"/>
+    <w:unhideWhenUsed/>
+    <w:rsid w:val="00B351DB"/>
+    <w:rPr>
+      <w:color w:val="467886" w:themeColor="hyperlink"/>
+      <w:u w:val="single"/>
+    </w:rPr>
+  </w:style>
+  <w:style w:type="character" w:styleId="UnresolvedMention">
+    <w:name w:val="Unresolved Mention"/>
+    <w:basedOn w:val="DefaultParagraphFont"/>
+    <w:uiPriority w:val="99"/>
+    <w:semiHidden/>
+    <w:unhideWhenUsed/>
+    <w:rsid w:val="00B351DB"/>
+    <w:rPr>
+      <w:color w:val="605E5C"/>
+      <w:shd w:val="clear" w:color="auto" w:fill="E1DFDD"/>
+    </w:rPr>
+  </w:style>
 </w:styles>
 </file>
 

</xml_diff>